<commit_message>
update class trc khi test
</commit_message>
<xml_diff>
--- a/guide.docx
+++ b/guide.docx
@@ -18,8 +18,192 @@
           <w:sz w:val="28"/>
           <w:szCs w:val="28"/>
         </w:rPr>
-        <w:t>fff</w:t>
-      </w:r>
+        <w:t xml:space="preserve">Cài </w:t>
+      </w:r>
+      <w:proofErr w:type="spellStart"/>
+      <w:r>
+        <w:rPr>
+          <w:rFonts w:ascii="Times New Roman" w:hAnsi="Times New Roman" w:cs="Times New Roman"/>
+          <w:sz w:val="28"/>
+          <w:szCs w:val="28"/>
+        </w:rPr>
+        <w:t>jdk</w:t>
+      </w:r>
+      <w:proofErr w:type="spellEnd"/>
+      <w:r>
+        <w:rPr>
+          <w:rFonts w:ascii="Times New Roman" w:hAnsi="Times New Roman" w:cs="Times New Roman"/>
+          <w:sz w:val="28"/>
+          <w:szCs w:val="28"/>
+        </w:rPr>
+        <w:t xml:space="preserve">, set up </w:t>
+      </w:r>
+      <w:proofErr w:type="spellStart"/>
+      <w:r>
+        <w:rPr>
+          <w:rFonts w:ascii="Times New Roman" w:hAnsi="Times New Roman" w:cs="Times New Roman"/>
+          <w:sz w:val="28"/>
+          <w:szCs w:val="28"/>
+        </w:rPr>
+        <w:t>môi</w:t>
+      </w:r>
+      <w:proofErr w:type="spellEnd"/>
+      <w:r>
+        <w:rPr>
+          <w:rFonts w:ascii="Times New Roman" w:hAnsi="Times New Roman" w:cs="Times New Roman"/>
+          <w:sz w:val="28"/>
+          <w:szCs w:val="28"/>
+        </w:rPr>
+        <w:t xml:space="preserve"> </w:t>
+      </w:r>
+      <w:proofErr w:type="spellStart"/>
+      <w:r>
+        <w:rPr>
+          <w:rFonts w:ascii="Times New Roman" w:hAnsi="Times New Roman" w:cs="Times New Roman"/>
+          <w:sz w:val="28"/>
+          <w:szCs w:val="28"/>
+        </w:rPr>
+        <w:t>trường</w:t>
+      </w:r>
+      <w:proofErr w:type="spellEnd"/>
+      <w:r>
+        <w:rPr>
+          <w:rFonts w:ascii="Times New Roman" w:hAnsi="Times New Roman" w:cs="Times New Roman"/>
+          <w:sz w:val="28"/>
+          <w:szCs w:val="28"/>
+        </w:rPr>
+        <w:t xml:space="preserve"> environment JAVA_HOME</w:t>
+      </w:r>
+    </w:p>
+    <w:p>
+      <w:pPr>
+        <w:spacing w:after="0"/>
+        <w:jc w:val="both"/>
+        <w:rPr>
+          <w:rFonts w:ascii="Times New Roman" w:hAnsi="Times New Roman" w:cs="Times New Roman"/>
+          <w:sz w:val="28"/>
+          <w:szCs w:val="28"/>
+        </w:rPr>
+      </w:pPr>
+      <w:proofErr w:type="spellStart"/>
+      <w:r>
+        <w:rPr>
+          <w:rFonts w:ascii="Times New Roman" w:hAnsi="Times New Roman" w:cs="Times New Roman"/>
+          <w:sz w:val="28"/>
+          <w:szCs w:val="28"/>
+        </w:rPr>
+        <w:t>Có</w:t>
+      </w:r>
+      <w:proofErr w:type="spellEnd"/>
+      <w:r>
+        <w:rPr>
+          <w:rFonts w:ascii="Times New Roman" w:hAnsi="Times New Roman" w:cs="Times New Roman"/>
+          <w:sz w:val="28"/>
+          <w:szCs w:val="28"/>
+        </w:rPr>
+        <w:t xml:space="preserve"> </w:t>
+      </w:r>
+      <w:proofErr w:type="spellStart"/>
+      <w:r>
+        <w:rPr>
+          <w:rFonts w:ascii="Times New Roman" w:hAnsi="Times New Roman" w:cs="Times New Roman"/>
+          <w:sz w:val="28"/>
+          <w:szCs w:val="28"/>
+        </w:rPr>
+        <w:t>thể</w:t>
+      </w:r>
+      <w:proofErr w:type="spellEnd"/>
+      <w:r>
+        <w:rPr>
+          <w:rFonts w:ascii="Times New Roman" w:hAnsi="Times New Roman" w:cs="Times New Roman"/>
+          <w:sz w:val="28"/>
+          <w:szCs w:val="28"/>
+        </w:rPr>
+        <w:t xml:space="preserve"> </w:t>
+      </w:r>
+      <w:proofErr w:type="spellStart"/>
+      <w:r>
+        <w:rPr>
+          <w:rFonts w:ascii="Times New Roman" w:hAnsi="Times New Roman" w:cs="Times New Roman"/>
+          <w:sz w:val="28"/>
+          <w:szCs w:val="28"/>
+        </w:rPr>
+        <w:t>kiểm</w:t>
+      </w:r>
+      <w:proofErr w:type="spellEnd"/>
+      <w:r>
+        <w:rPr>
+          <w:rFonts w:ascii="Times New Roman" w:hAnsi="Times New Roman" w:cs="Times New Roman"/>
+          <w:sz w:val="28"/>
+          <w:szCs w:val="28"/>
+        </w:rPr>
+        <w:t xml:space="preserve"> </w:t>
+      </w:r>
+      <w:proofErr w:type="spellStart"/>
+      <w:r>
+        <w:rPr>
+          <w:rFonts w:ascii="Times New Roman" w:hAnsi="Times New Roman" w:cs="Times New Roman"/>
+          <w:sz w:val="28"/>
+          <w:szCs w:val="28"/>
+        </w:rPr>
+        <w:t>tra</w:t>
+      </w:r>
+      <w:proofErr w:type="spellEnd"/>
+      <w:r>
+        <w:rPr>
+          <w:rFonts w:ascii="Times New Roman" w:hAnsi="Times New Roman" w:cs="Times New Roman"/>
+          <w:sz w:val="28"/>
+          <w:szCs w:val="28"/>
+        </w:rPr>
+        <w:t xml:space="preserve"> </w:t>
+      </w:r>
+      <w:proofErr w:type="spellStart"/>
+      <w:r>
+        <w:rPr>
+          <w:rFonts w:ascii="Times New Roman" w:hAnsi="Times New Roman" w:cs="Times New Roman"/>
+          <w:sz w:val="28"/>
+          <w:szCs w:val="28"/>
+        </w:rPr>
+        <w:t>bằng</w:t>
+      </w:r>
+      <w:proofErr w:type="spellEnd"/>
+      <w:r>
+        <w:rPr>
+          <w:rFonts w:ascii="Times New Roman" w:hAnsi="Times New Roman" w:cs="Times New Roman"/>
+          <w:sz w:val="28"/>
+          <w:szCs w:val="28"/>
+        </w:rPr>
+        <w:t xml:space="preserve"> java –version </w:t>
+      </w:r>
+      <w:proofErr w:type="spellStart"/>
+      <w:r>
+        <w:rPr>
+          <w:rFonts w:ascii="Times New Roman" w:hAnsi="Times New Roman" w:cs="Times New Roman"/>
+          <w:sz w:val="28"/>
+          <w:szCs w:val="28"/>
+        </w:rPr>
+        <w:t>trong</w:t>
+      </w:r>
+      <w:proofErr w:type="spellEnd"/>
+      <w:r>
+        <w:rPr>
+          <w:rFonts w:ascii="Times New Roman" w:hAnsi="Times New Roman" w:cs="Times New Roman"/>
+          <w:sz w:val="28"/>
+          <w:szCs w:val="28"/>
+        </w:rPr>
+        <w:t xml:space="preserve"> terminal</w:t>
+      </w:r>
+    </w:p>
+    <w:p>
+      <w:pPr>
+        <w:spacing w:after="0"/>
+        <w:jc w:val="both"/>
+        <w:rPr>
+          <w:rFonts w:ascii="Times New Roman" w:hAnsi="Times New Roman" w:cs="Times New Roman"/>
+          <w:sz w:val="28"/>
+          <w:szCs w:val="28"/>
+        </w:rPr>
+      </w:pPr>
     </w:p>
     <w:sectPr>
       <w:pgSz w:w="12240" w:h="15840"/>

</xml_diff>